<commit_message>
Inmobiliarias: corrige citas del art. 18, aritmética UMA, plazo día 17, multas art. 54 y actuación espontánea (art. 55)
Co-Authored-By: Claude Sonnet 5.5 <noreply@anthropic.com>
Claude-Session: https://claude.ai/code/session_01DVRJGYPU9dF2qt9pnwiF1P
</commit_message>
<xml_diff>
--- a/plantillas/inmobiliaria/CARTA_Bienvenida_Orientacion_Cliente.docx
+++ b/plantillas/inmobiliaria/CARTA_Bienvenida_Orientacion_Cliente.docx
@@ -232,25 +232,7 @@
                 <w:sz w:val="17"/>
                 <w:szCs w:val="17"/>
               </w:rPr>
-              <w:t>[</w:t>
-            </w:r>
-            <w:proofErr w:type="spellStart"/>
-            <w:r>
-              <w:rPr>
-                <w:color w:val="000000"/>
-                <w:sz w:val="17"/>
-                <w:szCs w:val="17"/>
-              </w:rPr>
-              <w:t>La_Empresa</w:t>
-            </w:r>
-            <w:proofErr w:type="spellEnd"/>
-            <w:r>
-              <w:rPr>
-                <w:color w:val="000000"/>
-                <w:sz w:val="17"/>
-                <w:szCs w:val="17"/>
-              </w:rPr>
-              <w:t>]</w:t>
+              <w:t>[La_Empresa]</w:t>
             </w:r>
           </w:p>
         </w:tc>
@@ -318,23 +300,7 @@
                 <w:sz w:val="17"/>
                 <w:szCs w:val="17"/>
               </w:rPr>
-              <w:t>[</w:t>
-            </w:r>
-            <w:r>
-              <w:rPr>
-                <w:color w:val="000000"/>
-                <w:sz w:val="17"/>
-                <w:szCs w:val="17"/>
-              </w:rPr>
-              <w:t>RFC</w:t>
-            </w:r>
-            <w:r>
-              <w:rPr>
-                <w:color w:val="000000"/>
-                <w:sz w:val="17"/>
-                <w:szCs w:val="17"/>
-              </w:rPr>
-              <w:t>]</w:t>
+              <w:t>[RFC]</w:t>
             </w:r>
           </w:p>
         </w:tc>
@@ -402,25 +368,7 @@
                 <w:sz w:val="17"/>
                 <w:szCs w:val="17"/>
               </w:rPr>
-              <w:t>[</w:t>
-            </w:r>
-            <w:proofErr w:type="spellStart"/>
-            <w:r>
-              <w:rPr>
-                <w:color w:val="000000"/>
-                <w:sz w:val="17"/>
-                <w:szCs w:val="17"/>
-              </w:rPr>
-              <w:t>RC_Nombre</w:t>
-            </w:r>
-            <w:proofErr w:type="spellEnd"/>
-            <w:r>
-              <w:rPr>
-                <w:color w:val="000000"/>
-                <w:sz w:val="17"/>
-                <w:szCs w:val="17"/>
-              </w:rPr>
-              <w:t>]</w:t>
+              <w:t>[RC_Nombre]</w:t>
             </w:r>
           </w:p>
         </w:tc>
@@ -488,18 +436,8 @@
                 <w:sz w:val="17"/>
                 <w:szCs w:val="17"/>
               </w:rPr>
-              <w:t xml:space="preserve">Jose Luis Naranjo Bobadilla — Bufete </w:t>
-            </w:r>
-            <w:proofErr w:type="spellStart"/>
-            <w:r>
-              <w:rPr>
-                <w:color w:val="000000"/>
-                <w:sz w:val="17"/>
-                <w:szCs w:val="17"/>
-              </w:rPr>
-              <w:t>Juridico</w:t>
-            </w:r>
-            <w:proofErr w:type="spellEnd"/>
+              <w:t xml:space="preserve">Jose Luis Naranjo Bobadilla — Bufete Juridico</w:t>
+            </w:r>
           </w:p>
         </w:tc>
       </w:tr>
@@ -566,25 +504,7 @@
                 <w:sz w:val="17"/>
                 <w:szCs w:val="17"/>
               </w:rPr>
-              <w:t>[</w:t>
-            </w:r>
-            <w:proofErr w:type="spellStart"/>
-            <w:r>
-              <w:rPr>
-                <w:color w:val="000000"/>
-                <w:sz w:val="17"/>
-                <w:szCs w:val="17"/>
-              </w:rPr>
-              <w:t>Fecha_Inicio_Programa</w:t>
-            </w:r>
-            <w:proofErr w:type="spellEnd"/>
-            <w:r>
-              <w:rPr>
-                <w:color w:val="000000"/>
-                <w:sz w:val="17"/>
-                <w:szCs w:val="17"/>
-              </w:rPr>
-              <w:t>]</w:t>
+              <w:t>[Fecha_Inicio_Programa]</w:t>
             </w:r>
           </w:p>
         </w:tc>
@@ -652,25 +572,7 @@
                 <w:sz w:val="17"/>
                 <w:szCs w:val="17"/>
               </w:rPr>
-              <w:t>[</w:t>
-            </w:r>
-            <w:proofErr w:type="spellStart"/>
-            <w:r>
-              <w:rPr>
-                <w:color w:val="000000"/>
-                <w:sz w:val="17"/>
-                <w:szCs w:val="17"/>
-              </w:rPr>
-              <w:t>Fecha_Cierre</w:t>
-            </w:r>
-            <w:proofErr w:type="spellEnd"/>
-            <w:r>
-              <w:rPr>
-                <w:color w:val="000000"/>
-                <w:sz w:val="17"/>
-                <w:szCs w:val="17"/>
-              </w:rPr>
-              <w:t>]</w:t>
+              <w:t>[Fecha_Cierre]</w:t>
             </w:r>
           </w:p>
         </w:tc>
@@ -732,23 +634,13 @@
             <w:pPr>
               <w:spacing w:after="80"/>
             </w:pPr>
-            <w:proofErr w:type="gramStart"/>
-            <w:r>
-              <w:rPr>
-                <w:color w:val="000000"/>
-                <w:sz w:val="17"/>
-                <w:szCs w:val="17"/>
-              </w:rPr>
-              <w:t>contacto@certusconsultores.com.mx  |</w:t>
-            </w:r>
-            <w:proofErr w:type="gramEnd"/>
-            <w:r>
-              <w:rPr>
-                <w:color w:val="000000"/>
-                <w:sz w:val="17"/>
-                <w:szCs w:val="17"/>
-              </w:rPr>
-              <w:t xml:space="preserve">  999 163 1363</w:t>
+            <w:r>
+              <w:rPr>
+                <w:color w:val="000000"/>
+                <w:sz w:val="17"/>
+                <w:szCs w:val="17"/>
+              </w:rPr>
+              <w:t xml:space="preserve">contacto@certusconsultores.com.mx  |  999 163 1363</w:t>
             </w:r>
           </w:p>
         </w:tc>
@@ -897,7 +789,7 @@
                 <w:sz w:val="17"/>
                 <w:szCs w:val="17"/>
               </w:rPr>
-              <w:t>• Obtención del beneficio de actuación espontánea (reducción de multas hasta 50% — Art. 47 Reglamento)</w:t>
+              <w:t>• Obtención del beneficio de actuación espontánea (Art. 55 de la Ley: exención por única ocasión o reducción de multas hasta 50%)</w:t>
             </w:r>
           </w:p>
           <w:p>
@@ -2356,7 +2248,7 @@
                 <w:sz w:val="17"/>
                 <w:szCs w:val="17"/>
               </w:rPr>
-              <w:t>✓ Presentar avisos mensuales al SAT dentro del plazo (17 días hábiles)</w:t>
+              <w:t>✓ Presentar avisos mensuales al SAT dentro del plazo (a más tardar el día 17 del mes siguiente)</w:t>
             </w:r>
           </w:p>
           <w:p>
@@ -2642,49 +2534,13 @@
               <w:spacing w:after="40"/>
               <w:jc w:val="center"/>
             </w:pPr>
-            <w:proofErr w:type="gramStart"/>
             <w:r>
               <w:rPr>
                 <w:color w:val="FFFFFF"/>
                 <w:sz w:val="16"/>
                 <w:szCs w:val="16"/>
               </w:rPr>
-              <w:t>contacto@certusconsultores.com.mx  |</w:t>
-            </w:r>
-            <w:proofErr w:type="gramEnd"/>
-            <w:r>
-              <w:rPr>
-                <w:color w:val="FFFFFF"/>
-                <w:sz w:val="16"/>
-                <w:szCs w:val="16"/>
-              </w:rPr>
-              <w:t xml:space="preserve">  999 163 </w:t>
-            </w:r>
-            <w:proofErr w:type="gramStart"/>
-            <w:r>
-              <w:rPr>
-                <w:color w:val="FFFFFF"/>
-                <w:sz w:val="16"/>
-                <w:szCs w:val="16"/>
-              </w:rPr>
-              <w:t>1363  |</w:t>
-            </w:r>
-            <w:proofErr w:type="gramEnd"/>
-            <w:r>
-              <w:rPr>
-                <w:color w:val="FFFFFF"/>
-                <w:sz w:val="16"/>
-                <w:szCs w:val="16"/>
-              </w:rPr>
-              <w:t xml:space="preserve">  Merida, </w:t>
-            </w:r>
-            <w:r>
-              <w:rPr>
-                <w:color w:val="FFFFFF"/>
-                <w:sz w:val="16"/>
-                <w:szCs w:val="16"/>
-              </w:rPr>
-              <w:t>Yucatán</w:t>
+              <w:t xml:space="preserve">contacto@certusconsultores.com.mx  |  999 163 1363  |  Merida, Yucatán</w:t>
             </w:r>
           </w:p>
           <w:p>
@@ -2698,54 +2554,8 @@
                 <w:sz w:val="15"/>
                 <w:szCs w:val="15"/>
               </w:rPr>
-              <w:t xml:space="preserve">Horario: </w:t>
-            </w:r>
-            <w:proofErr w:type="gramStart"/>
-            <w:r>
-              <w:rPr>
-                <w:color w:val="C9A84C"/>
-                <w:sz w:val="15"/>
-                <w:szCs w:val="15"/>
-              </w:rPr>
-              <w:t>Lunes</w:t>
-            </w:r>
-            <w:proofErr w:type="gramEnd"/>
-            <w:r>
-              <w:rPr>
-                <w:color w:val="C9A84C"/>
-                <w:sz w:val="15"/>
-                <w:szCs w:val="15"/>
-              </w:rPr>
-              <w:t xml:space="preserve"> a </w:t>
-            </w:r>
-            <w:proofErr w:type="gramStart"/>
-            <w:r>
-              <w:rPr>
-                <w:color w:val="C9A84C"/>
-                <w:sz w:val="15"/>
-                <w:szCs w:val="15"/>
-              </w:rPr>
-              <w:t>Viernes</w:t>
-            </w:r>
-            <w:proofErr w:type="gramEnd"/>
-            <w:r>
-              <w:rPr>
-                <w:color w:val="C9A84C"/>
-                <w:sz w:val="15"/>
-                <w:szCs w:val="15"/>
-              </w:rPr>
-              <w:t xml:space="preserve">, 09:00–18:00 </w:t>
-            </w:r>
-            <w:proofErr w:type="spellStart"/>
-            <w:r>
-              <w:rPr>
-                <w:color w:val="C9A84C"/>
-                <w:sz w:val="15"/>
-                <w:szCs w:val="15"/>
-              </w:rPr>
-              <w:t>hrs</w:t>
-            </w:r>
-            <w:proofErr w:type="spellEnd"/>
+              <w:t xml:space="preserve">Horario: Lunes a Viernes, 09:00–18:00 hrs</w:t>
+            </w:r>
           </w:p>
         </w:tc>
       </w:tr>

</xml_diff>